<commit_message>
Documentacion Proyecto Movil Actividad 1
</commit_message>
<xml_diff>
--- a/Informe/CM Jefferson Rojas ACT 1.docx
+++ b/Informe/CM Jefferson Rojas ACT 1.docx
@@ -238,22 +238,19 @@
         <w:spacing w:before="0" w:beforeAutospacing="0" w:after="0" w:afterAutospacing="0" w:line="360" w:lineRule="auto"/>
         <w:jc w:val="center"/>
         <w:textAlignment w:val="baseline"/>
-      </w:pPr>
-      <w:r>
         <w:rPr>
           <w:rStyle w:val="normaltextrun"/>
           <w:rFonts w:eastAsiaTheme="majorEastAsia"/>
           <w:lang w:val="es-ES"/>
         </w:rPr>
-        <w:t xml:space="preserve">NRC: </w:t>
-      </w:r>
+      </w:pPr>
       <w:r>
         <w:rPr>
           <w:rStyle w:val="normaltextrun"/>
           <w:rFonts w:eastAsiaTheme="majorEastAsia"/>
           <w:lang w:val="es-ES"/>
         </w:rPr>
-        <w:t>4</w:t>
+        <w:t>NRC</w:t>
       </w:r>
       <w:r>
         <w:rPr>
@@ -261,7 +258,7 @@
           <w:rFonts w:eastAsiaTheme="majorEastAsia"/>
           <w:lang w:val="es-ES"/>
         </w:rPr>
-        <w:t>0-</w:t>
+        <w:t xml:space="preserve">: </w:t>
       </w:r>
       <w:r>
         <w:rPr>
@@ -269,7 +266,7 @@
           <w:rFonts w:eastAsiaTheme="majorEastAsia"/>
           <w:lang w:val="es-ES"/>
         </w:rPr>
-        <w:t>60754</w:t>
+        <w:t>40-67844</w:t>
       </w:r>
     </w:p>
     <w:p>
@@ -625,7 +622,13 @@
     <w:sdt>
       <w:sdtPr>
         <w:rPr>
-          <w:lang w:val="es-ES"/>
+          <w:rFonts w:asciiTheme="minorHAnsi" w:eastAsiaTheme="minorHAnsi" w:hAnsiTheme="minorHAnsi" w:cstheme="minorBidi"/>
+          <w:color w:val="auto"/>
+          <w:kern w:val="2"/>
+          <w:sz w:val="22"/>
+          <w:szCs w:val="22"/>
+          <w:lang w:val="es-ES" w:eastAsia="en-US"/>
+          <w14:ligatures w14:val="standardContextual"/>
         </w:rPr>
         <w:id w:val="1030529996"/>
         <w:docPartObj>
@@ -635,15 +638,8 @@
       </w:sdtPr>
       <w:sdtEndPr>
         <w:rPr>
-          <w:rFonts w:asciiTheme="minorHAnsi" w:eastAsiaTheme="minorHAnsi" w:hAnsiTheme="minorHAnsi" w:cstheme="minorBidi"/>
           <w:b/>
           <w:bCs/>
-          <w:color w:val="auto"/>
-          <w:kern w:val="2"/>
-          <w:sz w:val="22"/>
-          <w:szCs w:val="22"/>
-          <w:lang w:eastAsia="en-US"/>
-          <w14:ligatures w14:val="standardContextual"/>
         </w:rPr>
       </w:sdtEndPr>
       <w:sdtContent>
@@ -4803,6 +4799,7 @@
       <w:r>
         <w:rPr>
           <w:rFonts w:ascii="Times New Roman" w:hAnsi="Times New Roman" w:cs="Times New Roman"/>
+          <w:noProof/>
         </w:rPr>
         <w:drawing>
           <wp:inline distT="0" distB="0" distL="0" distR="0" wp14:anchorId="7E8A4E99" wp14:editId="35D6F8AC">
@@ -6814,6 +6811,7 @@
       <w:r>
         <w:rPr>
           <w:rFonts w:ascii="Times New Roman" w:hAnsi="Times New Roman" w:cs="Times New Roman"/>
+          <w:noProof/>
         </w:rPr>
         <w:lastRenderedPageBreak/>
         <w:drawing>
@@ -8181,6 +8179,7 @@
       <w:r>
         <w:rPr>
           <w:rFonts w:ascii="Times New Roman" w:hAnsi="Times New Roman" w:cs="Times New Roman"/>
+          <w:noProof/>
         </w:rPr>
         <w:drawing>
           <wp:anchor distT="0" distB="0" distL="114300" distR="114300" simplePos="0" relativeHeight="251658240" behindDoc="0" locked="0" layoutInCell="1" allowOverlap="1" wp14:anchorId="1DAD96AA" wp14:editId="2791A907">
@@ -8434,18 +8433,7 @@
           <w:szCs w:val="24"/>
           <w:lang w:val="es-CO"/>
         </w:rPr>
-        <w:t xml:space="preserve"> en las etapas de análisis y diseño del desarrollo de software. Innovación y Software, 3(1), 17–29. Universidad La Salle, Perú.</w:t>
-      </w:r>
-      <w:r>
-        <w:rPr>
-          <w:rFonts w:ascii="Times New Roman" w:hAnsi="Times New Roman" w:cs="Times New Roman"/>
-          <w:i/>
-          <w:iCs/>
-          <w:sz w:val="24"/>
-          <w:szCs w:val="24"/>
-          <w:lang w:val="es-CO"/>
-        </w:rPr>
-        <w:t xml:space="preserve"> </w:t>
+        <w:t xml:space="preserve"> en las etapas de análisis y diseño del desarrollo de software. Innovación y Software, 3(1), 17–29. Universidad La Salle, Perú. </w:t>
       </w:r>
       <w:hyperlink r:id="rId12" w:tgtFrame="_blank" w:history="1">
         <w:r>
@@ -8511,18 +8499,7 @@
           <w:szCs w:val="24"/>
           <w:lang w:val="es-CO"/>
         </w:rPr>
-        <w:t>, R. A. (2021). Comparativa de tendencias de desarrollo de software móvil. 3C TIC: Cuadernos de desarrollo aplicados a las TIC, 10(1), 123–147.</w:t>
-      </w:r>
-      <w:r>
-        <w:rPr>
-          <w:rFonts w:ascii="Times New Roman" w:hAnsi="Times New Roman" w:cs="Times New Roman"/>
-          <w:i/>
-          <w:iCs/>
-          <w:sz w:val="24"/>
-          <w:szCs w:val="24"/>
-          <w:lang w:val="es-CO"/>
-        </w:rPr>
-        <w:t xml:space="preserve"> </w:t>
+        <w:t xml:space="preserve">, R. A. (2021). Comparativa de tendencias de desarrollo de software móvil. 3C TIC: Cuadernos de desarrollo aplicados a las TIC, 10(1), 123–147. </w:t>
       </w:r>
       <w:hyperlink r:id="rId13" w:tgtFrame="_blank" w:history="1">
         <w:r>

</xml_diff>